<commit_message>
Fix 5-month Telegram master notes: eliminate broken link artifacts, convert to 50-word RAS study notes format, ensure multi-channel coverage
</commit_message>
<xml_diff>
--- a/RPSC_UPSC_Daily_AI_Agent/Output_Notes/RAS_UPSC_Notes_2026-09-17.docx
+++ b/RPSC_UPSC_Daily_AI_Agent/Output_Notes/RAS_UPSC_Notes_2026-09-17.docx
@@ -24,10 +24,10 @@
         <w:rPr>
           <w:b/>
         </w:rPr>
-        <w:t xml:space="preserve">• [पिग्मी हॉग संरक्षण कार्यक्रम (Assam's Pygmy Hog Program)] </w:t>
+        <w:t xml:space="preserve">• [पिग्मी हॉग संरक्षण कार्यक्रम (Assam's Pygmy Hog Programme)] </w:t>
       </w:r>
       <w:r>
-        <w:t>पिग्मी हॉग (Porcula salvania) विश्व का सबसे छोटा और दुर्लभतम जंगली सुअर है। यह आईयूसीएन (IUCN) की संकटग्रस्त (Endangered) श्रेणी में शामिल है। असम के घास के मैदानों (Grasslands) का यह एक प्रमुख संकेतक संकेतक प्रजाति (Indicator Species) है।</w:t>
+        <w:t>पिग्मी हॉग (Porcula salvania) विश्व का सबसे छोटा और दुर्लभतम जंगली सुअर है। यह केवल असम के तराई घास के मैदानों (जैसे मानस राष्ट्रीय उद्यान) में पाया जाता है। आईयूसीएन (IUCN) की लाल सूची में इसे 'लुप्तप्राय' (Endangered) श्रेणी में रखा गया है। इसका अस्तित्व घास के मैदानों के पारिस्थितिकी तंत्र के स्वास्थ्य का सूचक है।</w:t>
       </w:r>
     </w:p>
     <w:p>
@@ -35,10 +35,10 @@
         <w:rPr>
           <w:b/>
         </w:rPr>
-        <w:t xml:space="preserve">• [RoDTEP योजना एवं निर्यात अनुपालन छूट] </w:t>
+        <w:t xml:space="preserve">• [18वां ब्रिक्स शिखर सम्मेलन और नई दिल्ली घोषणापत्र] </w:t>
       </w:r>
       <w:r>
-        <w:t>केंद्र सरकार ने 3 लाख रुपये तक के निर्यात शिपमेंट के लिए पंजीकरण प्रमाणपत्र (Registration Certificate) की अनिवार्यता समाप्त कर दी है। इसके अतिरिक्त, सरकार निर्यात संवर्धन योजना RoDTEP (Remission of Duties and Taxes on Exported Products) को 5 वर्ष का विस्तार देने पर विचार कर रही है।</w:t>
+        <w:t>18वें ब्रिक्स (BRICS) शिखर सम्मेलन का आयोजन नई दिल्ली में किया गया, जिसमें 'नई दिल्ली घोषणापत्र' को अपनाया गया। इस घोषणापत्र में पारंपरिक वैश्विक शक्ति समीकरणों में सुधार, स्थानीय मुद्राओं में व्यापार को बढ़ावा देने और बहुपक्षीय वित्तीय संस्थानों में सुधार पर बल दिया गया।</w:t>
       </w:r>
     </w:p>
     <w:p>
@@ -46,10 +46,10 @@
         <w:rPr>
           <w:b/>
         </w:rPr>
-        <w:t xml:space="preserve">• [JAAR (Judicial Anti-Avoidance Rules)] </w:t>
+        <w:t xml:space="preserve">• [RoDTEP योजना और निर्यात अनुपालन में ढील] </w:t>
       </w:r>
       <w:r>
-        <w:t>कर विभाग द्वारा हाल ही में मॉरीशस संधि के संदर्भ में JAAR (एक प्रकार का GAAR उपकरण) को लागू किया गया है। यह कर चोरी और आक्रामक कर नियोजन (Aggressive Tax Planning) को रोकने के लिए प्रयुक्त एक न्यायिक उपकरण है, जो ग्रैंडफादर्ड शेयरों (Grandfathered Shares) पर कर छूट के दावों की समीक्षा करता है।</w:t>
+        <w:t>केंद्र सरकार ने 3 लाख रुपये तक के निर्यात शिपमेंट के लिए पंजीकरण प्रमाणपत्र (Registration Certificate) की अनिवार्यता को समाप्त कर दिया है। इसके साथ ही निर्यात संवर्धन योजना RoDTEP (Remission of Duties and Taxes on Exported Products) को अगले 5 वर्षों के लिए विस्तारित करने का प्रस्ताव रखा गया है।</w:t>
       </w:r>
     </w:p>
     <w:p>
@@ -57,10 +57,10 @@
         <w:rPr>
           <w:b/>
         </w:rPr>
-        <w:t xml:space="preserve">• [प्रोजेक्ट वसुधा (Project Vasudha)] </w:t>
+        <w:t xml:space="preserve">• [JAAR (Judicial Anti-Avoidance Rules) और मॉरीशस संधि] </w:t>
       </w:r>
       <w:r>
-        <w:t>आंध्र प्रदेश राज्य कौशल विकास निगम (APSSDC) द्वारा शुरू किया गया एक कार्यक्रम, जिसके तहत भारतीय नर्सों को जर्मनी में रोजगार के अवसर प्रदान करने के लिए प्रशिक्षित और सुसज्जित किया जा रहा है।</w:t>
+        <w:t>कर विभाग द्वारा हाल ही में JAAR (एक GAAR-समान उपकरण) का उपयोग मॉरीशस कर संधि के तहत आने वाले कुछ मामलों में किया गया है। यह कदम सीबीडीटी (CBDT) के उस आश्वासन के विपरीत है जिसमें 'ग्रैंडफादर्ड' (पुराने) शेयरों को गार (GAAR) के दायरे से बाहर रखने की बात कही गई थी।</w:t>
       </w:r>
     </w:p>
     <w:p>
@@ -68,10 +68,10 @@
         <w:rPr>
           <w:b/>
         </w:rPr>
-        <w:t xml:space="preserve">• [शहजाद भट्टी नेटवर्क (UAPA घोषणा)] </w:t>
+        <w:t xml:space="preserve">• [सेमीकंडक्टर एडवांस्ड पैकेजिंग (Advanced Packaging)] </w:t>
       </w:r>
       <w:r>
-        <w:t>केंद्रीय गृह मंत्रालय ने गैर-कानूनी गतिविधियां (रोकथाम) अधिनियम (UAPA) के तहत 'शहजाद भट्टी नेटवर्क' को एक आतंकवादी संगठन घोषित किया है। यह नेटवर्क देश की आंतरिक सुरक्षा के लिए गंभीर खतरा माना गया है।</w:t>
+        <w:t>एडवांस्ड पैकेजिंग सेमीकंडक्टर निर्माण की एक कम पूंजी-गहन (low-capital) तकनीक है। यह भारत को वैश्विक स्तर पर फैब (Fab) निर्माण के बिना भी सेमीकंडक्टर पारिस्थितिकी तंत्र और प्रतिभा पूल विकसित करने का एक व्यवहार्य मार्ग प्रदान करती है।</w:t>
       </w:r>
     </w:p>
     <w:p>
@@ -79,10 +79,10 @@
         <w:rPr>
           <w:b/>
         </w:rPr>
-        <w:t xml:space="preserve">• [सहर्ष विशेष शिक्षा कार्यक्रम (Saharsh Program)] </w:t>
+        <w:t xml:space="preserve">• [डेटा सेंटर जल खपत रिपोर्ट (Rystad Energy Report)] </w:t>
       </w:r>
       <w:r>
-        <w:t>त्रिपुरा राज्य सरकार द्वारा सामाजिक और भावनात्मक शिक्षा (Social and Emotional Learning - SEL) को बढ़ावा देने के लिए 'सहर्ष' नामक विशेष शिक्षा कार्यक्रम शुरू किया गया है।</w:t>
+        <w:t>रैस्टैड एनर्जी (Rystad Energy) के अनुसार, कृत्रिम बुद्धिमत्ता (AI) के विस्तार के कारण वैश्विक डेटा सेंटरों की प्रत्यक्ष जल खपत वर्ष 2025 के 222 बिलियन लीटर से तीन गुना बढ़कर 2030 तक 644 बिलियन लीटर प्रति वर्ष हो सकती है। जल उपयोग प्रभावशीलता (WUE) इसका प्रमुख मापक है।</w:t>
       </w:r>
     </w:p>
     <w:p>
@@ -90,10 +90,10 @@
         <w:rPr>
           <w:b/>
         </w:rPr>
-        <w:t xml:space="preserve">• [EPFO क्षेत्रीय कार्यालय, अलवर] </w:t>
+        <w:t xml:space="preserve">• [डायनोडोंटोसॉरस इसियावामैंडा (Dinodontosaurus isiyavamanda)] </w:t>
       </w:r>
       <w:r>
-        <w:t>केंद्रीय श्रम एवं रोजगार मंत्री भूपेंद्र यादव ने राजस्थान के अलवर जिले में कर्मचारी भविष्य निधि संगठन (EPFO) के नए क्षेत्रीय कार्यालय का उद्घाटन किया है, जिससे स्थानीय श्रमिकों को त्वरित सेवाएं मिल सकेंगी।</w:t>
+        <w:t>तंजानिया में खोजा गया 240 मिलियन वर्ष पुराना जीवाश्म है, जो पहले केवल दक्षिण अमेरिका में पाया जाता था। यह खोज तंजानिया और दक्षिण अमेरिका के जीवाश्म निक्षेपों को जोड़ती है और डायनासोर के प्रारंभिक विकासवादी कालक्रम को पुनर्निर्धारित करती है।</w:t>
       </w:r>
     </w:p>
     <w:p>
@@ -101,10 +101,10 @@
         <w:rPr>
           <w:b/>
         </w:rPr>
-        <w:t xml:space="preserve">• [छेरछेरा पारंपरिक उत्सव] </w:t>
+        <w:t xml:space="preserve">• [चारिक्लो के वलय (Chariklo's Rings)] </w:t>
       </w:r>
       <w:r>
-        <w:t>यह छत्तीसगढ़ का एक पारंपरिक लोक उत्सव है, जो हिंदू कैलेंडर के 'पौष' माह की पूर्णिमा की रात को रायपुर के ऐतिहासिक दूधाधारी मठ में मनाया जाता है। यह दान और फसल कटाई की खुशी का प्रतीक है।</w:t>
+        <w:t>जेम्स वेब स्पेस टेलीस्कोप (JWST) ने शनि और अरुण (Uranus) के बीच परिक्रमा करने वाले एक छोटे खगोलीय पिंड 'चारिक्लो' के चारों ओर मौजूद रहस्यमयी वलयों में तीव्र गति से होने वाले परिवर्तनों का खुलासा किया है, जो वैज्ञानिकों की पूर्व धारणाओं से अधिक गतिशील हैं।</w:t>
       </w:r>
     </w:p>
     <w:p>
@@ -112,10 +112,10 @@
         <w:rPr>
           <w:b/>
         </w:rPr>
-        <w:t xml:space="preserve">• [सिबिल (Sybil) AI टूल] </w:t>
+        <w:t xml:space="preserve">• [शहजाद भट्टी नेटवर्क (UAPA के तहत आतंकवादी घोषित)] </w:t>
       </w:r>
       <w:r>
-        <w:t>मैसाचुसेट्स जनरल अस्पताल के शोधकर्ताओं द्वारा विकसित एक कृत्रिम बुद्धिमत्ता (AI) उपकरण, जो धूम्रपान के इतिहास वाले या बिना इतिहास वाले व्यक्तियों में आगामी 6 वर्षों तक फेफड़ों के कैंसर के जोखिम की सटीक भविष्यवाणी कर सकता है।</w:t>
+        <w:t>केंद्रीय गृह मंत्रालय ने गैर-कानूनी गतिविधियां (रोकथाम) अधिनियम (UAPA), 1967 के तहत 'शहजाद भट्टी नेटवर्क' को एक आतंकवादी संगठन घोषित किया है। यह नेटवर्क राष्ट्र-विरोधी गतिविधियों और सीमा पार तस्करी में संलिप्त पाया गया है।</w:t>
       </w:r>
     </w:p>
     <w:p>
@@ -123,10 +123,10 @@
         <w:rPr>
           <w:b/>
         </w:rPr>
-        <w:t xml:space="preserve">• [बनीवाला की ढाणी (नीम का थाना)] </w:t>
+        <w:t xml:space="preserve">• [सहरश विशेष शिक्षा कार्यक्रम (Saharsh Program)] </w:t>
       </w:r>
       <w:r>
-        <w:t>राजस्थान के नीम का थाना जिले में स्थित 'बनीवाला की ढाणी' क्षेत्र तांबा (Copper) खनिज के समृद्ध भंडारों के लिए प्रसिद्ध है।</w:t>
+        <w:t>त्रिपुरा राज्य सरकार द्वारा सामाजिक और भावनात्मक शिक्षा (Social and Emotional Learning) को बढ़ावा देने के लिए 'सहरश' (Saharsh) नामक विशेष शिक्षा कार्यक्रम शुरू किया गया है।</w:t>
       </w:r>
     </w:p>
     <w:p>
@@ -134,10 +134,10 @@
         <w:rPr>
           <w:b/>
         </w:rPr>
-        <w:t xml:space="preserve">• [राजपूत पेंटिंग (1916) एवं राजस्थानी चित्रकला] </w:t>
+        <w:t xml:space="preserve">• [आकांक्षी ब्लॉक कार्यक्रम (Aspirational Block Programme - ABP)] </w:t>
       </w:r>
       <w:r>
-        <w:t>वर्ष 1916 में आनंद कुमार स्वामी ने 'राजपूत पेंटिंग' नामक पुस्तक लिखी, जिसमें उन्होंने पहाड़ी चित्रशैली को भी शामिल किया। वहीं, डब्ल्यू.एच. ब्राउन ने अपने ग्रंथ 'इंडियन पेंटिंग्स' में इस क्षेत्र की कला को 'राजस्थानी चित्रकला' नाम दिया।</w:t>
+        <w:t>प्रधानमंत्री नरेंद्र मोदी द्वारा वर्ष 2018 के 'आकांक्षी जिला कार्यक्रम' की तर्ज पर देश के पिछड़े ब्लॉकों के विकास हेतु 'आकांक्षी ब्लॉक कार्यक्रम' का शुभारंभ किया गया है, जिसके तहत स्थानीय स्तर पर सुशासन और विकास संकेतकों में सुधार किया जाएगा।</w:t>
       </w:r>
     </w:p>
     <w:p>
@@ -145,10 +145,10 @@
         <w:rPr>
           <w:b/>
         </w:rPr>
-        <w:t xml:space="preserve">• [चाँद बावड़ी (आभानेरी)] </w:t>
+        <w:t xml:space="preserve">• [छेरछेरा त्यौहार (Cherchera Festival)] </w:t>
       </w:r>
       <w:r>
-        <w:t>दौसा जिले के आभानेरी में स्थित चाँद बावड़ी राजस्थान की सबसे कलात्मक और गहरी बावड़ियों में से एक है। इसका निर्माण गुर्जर-प्रतिहार शासक राजा मिहिर भोज (चाँद) द्वारा करवाया गया था।</w:t>
+        <w:t>यह छत्तीसगढ़ का एक पारंपरिक लोक उत्सव है जो हिंदू कैलेंडर के 'पौष' माह की पूर्णिमा को मनाया जाता है। यह फसल कटाई की खुशी और दान-पुण्य की संस्कृति से संबंधित है।</w:t>
       </w:r>
     </w:p>
     <w:p>
@@ -156,10 +156,10 @@
         <w:rPr>
           <w:b/>
         </w:rPr>
-        <w:t xml:space="preserve">• [मिशन 'पढ़ो राजस्थान'] </w:t>
+        <w:t xml:space="preserve">• [सिबिल (Sybil) एआई टूल] </w:t>
       </w:r>
       <w:r>
-        <w:t>राजस्थान शिक्षा विभाग द्वारा प्राथमिक स्तर के छात्रों में बुनियादी साक्षरता और संख्यात्मकता (FLN) में सुधार के लिए कक्षा 1 से 5 तक के बच्चों हेतु 'मिशन पढ़ो राजस्थान' का संचालन किया जा रहा है।</w:t>
+        <w:t>मैसाचुसेट्स जनरल अस्पताल के शोधकर्ताओं द्वारा विकसित एक कृत्रिम बुद्धिमत्ता (AI) उपकरण है, जो धूम्रपान के इतिहास वाले या बिना इतिहास वाले व्यक्तियों में आगामी 6 वर्षों तक फेफड़ों के कैंसर के जोखिम की सटीक भविष्यवाणी कर सकता है।</w:t>
       </w:r>
     </w:p>
     <w:p>
@@ -167,10 +167,21 @@
         <w:rPr>
           <w:b/>
         </w:rPr>
-        <w:t xml:space="preserve">• [महावीर जी का मेला] </w:t>
+        <w:t xml:space="preserve">• [विक्रम साराभाई अंतरिक्ष प्रदर्शनी - अलवर] </w:t>
       </w:r>
       <w:r>
-        <w:t>राजस्थान के करौली जिले में श्री महावीर जी का प्रसिद्ध मेला प्रतिवर्ष चैत्र शुक्ल त्रयोदशी से वैशाख कृष्ण द्वितीया तक आयोजित किया जाता है। यह जैन धर्म का एक प्रमुख मेला है।</w:t>
+        <w:t>राजस्थान के अलवर जिले में अंतरिक्ष विज्ञान के प्रति छात्रों और आम जनता में जागरूकता बढ़ाने के उद्देश्य से 'विक्रम साराभाई स्पेस प्रदर्शनी' का भव्य शुभारंभ किया गया है।</w:t>
+      </w:r>
+    </w:p>
+    <w:p>
+      <w:r>
+        <w:rPr>
+          <w:b/>
+        </w:rPr>
+        <w:t xml:space="preserve">• [कॉप्स टर्फ ग्राउंड (Cops Turf Ground) - भीलवाड़ा] </w:t>
+      </w:r>
+      <w:r>
+        <w:t>राजस्थान के भीलवाड़ा जिले में आधुनिक खेल सुविधाओं से युक्त एक नए इंडोर क्रिकेट स्टेडियम 'कॉप्स टर्फ ग्राउंड' का निर्माण किया गया है, जो राज्य में खेल प्रतिभाओं को बढ़ावा देगा।</w:t>
       </w:r>
     </w:p>
     <w:p>
@@ -186,15 +197,15 @@
         <w:rPr>
           <w:b/>
         </w:rPr>
-        <w:t>प्रश्न [5 अंक - Paper 1]: सेमीकंडक्टर उद्योग में 'एडवांस्ड पैकेजिंग' (Advanced Packaging) से क्या तात्पर्य है? भारत के लिए इसके महत्व को स्पष्ट कीजिए।</w:t>
+        <w:t>प्रश्न [5 अंक - Paper 1]: राजस्थान की पारंपरिक 'कावड़ कला' पर एक संक्षिप्त टिप्पणी लिखिए।</w:t>
         <w:br/>
       </w:r>
       <w:r>
-        <w:t>उत्तर: 1. **अवधारणा**: एडवांस्ड पैकेजिंग चिप निर्माण की वह प्रक्रिया है जिसमें कई अलग-अलग चिप्स (डिलेट्स) को एक ही पैकेज में एकीकृत किया जाता है, जिससे प्रदर्शन बढ़ता है और बिजली की खपत कम होती है।</w:t>
+        <w:t>उत्तर: 1. **परिभाषा व स्वरूप:** कावड़ लकड़ी से बना एक मंदिरनुमा ढांचा होता है, जिसमें कई कपाट (द्वार) होते हैं। इन कपाटों पर पौराणिक कथाओं और लोक देवताओं के चित्र अंकित होते हैं।</w:t>
         <w:br/>
-        <w:t>2. **भारत के लिए महत्व**: यह भारत को विशाल पूंजी-गहन फैब्रिकेशन (Fab) संयंत्रों की तुलना में कम पूंजी निवेश के साथ सेमीकंडक्टर विनिर्माण श्रृंखला में प्रवेश करने का मार्ग प्रशस्त करता है।</w:t>
+        <w:t>2. **प्रमुख केंद्र व कलाकार:** चित्तौड़गढ़ का 'बस्सी' गांव कावड़ निर्माण का मुख्य केंद्र है। मांगीलाल मिस्त्री इस लोक-कला के प्रसिद्ध मूर्धन्य कलाकार हैं।</w:t>
         <w:br/>
-        <w:t>3. **पारिस्थितिकी तंत्र का विकास**: यह देश में तकनीकी प्रतिभा, असेंबली, परीक्षण और वैश्विक आपूर्ति श्रृंखला प्रणालियों को स्थापित करने में सहायक है।</w:t>
+        <w:t>3. **सांस्कृतिक महत्व:** कावड़िया भाट इन कपाटों को एक-एक करके खोलते हुए लोक कथाओं और भजनों का वाचन करते हैं। इसे 'चलता-फिरता देवघर' भी कहा जाता है।</w:t>
         <w:br/>
       </w:r>
     </w:p>
@@ -203,15 +214,15 @@
         <w:rPr>
           <w:b/>
         </w:rPr>
-        <w:t>प्रश्न [5 अंक - Paper 3]: हिमालयी क्षेत्र में 'पीक वाटर' (Peak Water) की अवधारणा को समझाते हुए इसके संभावित खतरों पर प्रकाश डालिए।</w:t>
+        <w:t>प्रश्न [5 अंक - Paper 1]: जयनारायण व्यास द्वारा संपादित 'आगीबाण' समाचार पत्र के ऐतिहासिक महत्व को स्पष्ट कीजिए।</w:t>
         <w:br/>
       </w:r>
       <w:r>
-        <w:t>उत्तर: 1. **अवधारणा**: 'पीक वाटर' उस समय बिंदु को दर्शाता है जब ग्लेशियरों के पिघलने के कारण नदियों का जल प्रवाह अपने अधिकतम स्तर पर पहुँच जाता है, जिसके बाद प्रवाह में निरंतर गिरावट शुरू हो जाती है।</w:t>
+        <w:t>उत्तर: 1. **प्रकाशन व संपादन:** 'आगीबाण' का संपादन और प्रकाशन प्रख्यात स्वतंत्रता सेनानी और राजस्थान के पूर्व मुख्यमंत्री जयनारायण व्यास (लोकनायक) द्वारा किया गया था।</w:t>
         <w:br/>
-        <w:t>2. **समय सीमा**: हालिया रिपोर्टों के अनुसार, हिमालयी क्षेत्र में मध्य शताब्दी (2050 के आसपास) तक पीक वाटर की स्थिति आ सकती है।</w:t>
+        <w:t>2. **भाषाई महत्व:** यह राजस्थानी भाषा का प्रथम राजनीतिक समाचार पत्र था, जिसने स्थानीय बोली में जन-जागरण का कार्य किया।</w:t>
         <w:br/>
-        <w:t>3. **संभावित खतरे**: इसके बाद गंगा, सिंधु और ब्रह्मपुत्र जैसी बारहमासी नदियों के जल स्तर में भारी कमी आएगी, जिससे कृषि, पेयजल सुरक्षा और जलविद्युत परियोजनाओं पर गंभीर संकट उत्पन्न होगा।</w:t>
+        <w:t>3. **भूमिका:** इसने जागीरदारी उत्पीड़न, रियासती कुशासन और ब्रिटिश साम्राज्यवाद के विरुद्ध तीखी आवाज उठाई तथा मारवाड़ प्रजामंडल आंदोलन को वैचारिक संबल प्रदान किया।</w:t>
         <w:br/>
       </w:r>
     </w:p>
@@ -220,38 +231,33 @@
         <w:rPr>
           <w:b/>
         </w:rPr>
-        <w:t>प्रश्न [10 अंक - Paper 3]: कृत्रिम बुद्धिमत्ता (AI) के तीव्र विकास के कारण वैश्विक डेटा केंद्रों (Data Centres) में जल और ऊर्जा की खपत के बढ़ते संकट का समालोचनात्मक विश्लेषण कीजिए। इसके समाधान हेतु क्या नियामक उपाय किए जाने चाहिए?</w:t>
+        <w:t>प्रश्न [10 अंक - Paper 2]: डेटा सेंटरों के तीव्र विस्तार से उत्पन्न होने वाली पर्यावरणीय चुनौतियों (विशेषकर जल संकट) का विश्लेषण कीजिए। चिली के 'MOSACAT' जन-आंदोलन से भारत क्या सीख ले सकता है?</w:t>
         <w:br/>
       </w:r>
       <w:r>
-        <w:t>भूमिका: वैश्विक स्तर पर जनरेटिव एआई (Generative AI) और क्लाउड कंप्यूटिंग के विस्तार ने डेटा केंद्रों की संख्या में अभूतपूर्व वृद्धि की है। ये डेटा केंद्र भारी मात्रा में बिजली और कूलिंग के लिए पानी का उपभोग करते हैं, जो एक नया पर्यावरणीय संकट बन रहा है।</w:t>
+        <w:t>भूमिका: वैश्विक स्तर पर डिजिटल अर्थव्यवस्था और कृत्रिम बुद्धिमत्ता (AI) के प्रसार ने डेटा सेंटरों की मांग को अत्यधिक बढ़ा दिया है, जिससे ऊर्जा और जल संसाधनों पर अभूतपूर्व दबाव उत्पन्न हो गया है।</w:t>
         <w:br/>
       </w:r>
       <w:r>
-        <w:t>मुख्य भाग: 1. **संकट के प्रमुख बिंदु (डेटा और साक्ष्य)**:</w:t>
+        <w:t>मुख्य भाग: 1. **पर्यावरणीय चुनौतियां (जल व ऊर्जा संकट):**</w:t>
         <w:br/>
-        <w:t xml:space="preserve">   - **जल की खपत**: रिस्टैड एनर्जी के अनुसार, डेटा केंद्रों की प्रत्यक्ष जल खपत वर्ष 2025 के 222 बिलियन लीटर से तीन गुना बढ़कर 2030 तक 644 बिलियन लीटर हो सकती है।</w:t>
+        <w:t xml:space="preserve">   - **अत्यधिक जल खपत:** डेटा सेंटरों के सर्वरों को ठंडा रखने के लिए लाखों लीटर पानी की आवश्यकता होती है। रैस्टैड एनर्जी के अनुसार, 2030 तक यह खपत 644 बिलियन लीटर तक पहुंच सकती है।</w:t>
         <w:br/>
-        <w:t xml:space="preserve">   - **ऊर्जा की मांग**: एआई सर्वर पारंपरिक सर्वरों की तुलना में अत्यधिक गर्मी उत्पन्न करते हैं। ड्राई कूलिंग (Dry Cooling) तकनीक पानी तो बचाती है, लेकिन यह प्रति किलोवाट-घंटा 0.30 से 0.74 kWh अतिरिक्त बिजली की मांग करती है।</w:t>
+        <w:t xml:space="preserve">   - **ताप द्वीप (Heat Island) प्रभाव:** डेटा सेंटरों के आसपास के 10 किमी क्षेत्र में तापमान में 9 डिग्री सेल्सियस तक की वृद्धि देखी गई है।</w:t>
         <w:br/>
-        <w:t xml:space="preserve">   - **अप्रत्यक्ष जल पदचिह्न (Indirect Water Footprint)**: बिजली उत्पादन में प्रयुक्त पानी के कारण डेटा केंद्रों का अप्रत्यक्ष जल पदचिह्न उनके प्रत्यक्ष उपयोग से दोगुना तक हो सकता है।</w:t>
+        <w:t xml:space="preserve">   - **भूजल दोहन:** अधिकांश डेटा सेंटर उन क्षेत्रों में स्थापित हैं जो पहले से ही गंभीर जल तनाव (Water Stress) का सामना कर रहे हैं (जैसे भारत में जामनगर और ठाणे)।</w:t>
         <w:br/>
-        <w:t xml:space="preserve">   - **भौगोलिक असमानता**: अमेज़न (AWS), मेटा और गूगल जैसी कंपनियों की जल उपयोग प्रभावशीलता (WUE) में भौगोलिक आधार पर 100 गुना तक का अंतर देखा गया है (जैसे स्टॉकहोम में 0.02 लीटर/kWh बनाम जकार्ता में 2.85 लीटर/kWh)।</w:t>
+        <w:t>2. **चिली के 'MOSACAT' आंदोलन से सीख:**</w:t>
         <w:br/>
+        <w:t xml:space="preserve">   - **सामुदायिक भागीदारी:** चिली के सेरिलोस (Cerrillos) में स्थानीय निवासियों ने गूगल के $200 मिलियन के डेटा सेंटर प्रोजेक्ट का विरोध कर उसे एयर-कूलिंग तकनीक अपनाने पर मजबूर किया। भारत को भी परियोजनाओं की मंजूरी में स्थानीय समुदायों की 'बाध्यकारी भागीदारी' (Binding Participation) सुनिश्चित करनी चाहिए।</w:t>
         <w:br/>
-        <w:t>2. **नियामक एवं सुधारात्मक उपाय**:</w:t>
+        <w:t xml:space="preserve">   - **पर्यावरणीय प्रभाव आकलन (EIA):** केवल 'घोषणापत्र' (Declaration) के बजाय विस्तृत 'पर्यावरणीय प्रभाव अध्ययन' (EIS) अनिवार्य होना चाहिए।</w:t>
         <w:br/>
-        <w:t xml:space="preserve">   - **सख्त WUE मानक**: सिंगापुर के 'ग्रीन डेटा सेंटर रोडमैप' की तर्ज पर पानी की खपत को 2 लीटर प्रति kWh (2 cubic metres per MWh) से कम करने का मानक अनिवार्य किया जाए।</w:t>
-        <w:br/>
-        <w:t xml:space="preserve">   - **पर्यावरणीय प्रभाव आकलन (EIA)**: चिली के सेरिलोस (Cerrillos) में गूगल डेटा सेंटर के खिलाफ हुए नागरिक आंदोलन (MOSACAT) से सीख लेते हुए, डेटा केंद्रों को केवल 'घोषणा' के बजाय पूर्ण 'पर्यावरणीय प्रभाव अध्ययन' के दायरे में लाया जाए।</w:t>
-        <w:br/>
-        <w:t xml:space="preserve">   - **वाटर पॉजिटिव लक्ष्य**: टेक कंपनियों को 2030 तक 'वाटर पॉजिटिव' (जितना पानी उपभोग करें, उससे अधिक का पुनर्भरण करें) बनने के लिए कानूनी रूप से बाध्य किया जाए।</w:t>
-        <w:br/>
-        <w:t xml:space="preserve">   - **स्थान का चयन**: डेटा केंद्रों को अत्यधिक जल-तनाव वाले क्षेत्रों (जैसे भारत के जामनगर व ठाणे) के बजाय ठंडे भौगोलिक क्षेत्रों में स्थापित करने को प्राथमिकता दी जाए।</w:t>
+        <w:t xml:space="preserve">   - **तकनीकी बदलाव:** जल-कूलिंग के स्थान पर शुष्क-कूलिंग (Dry Cooling) और नवीकरणीय ऊर्जा स्रोतों के उपयोग को बढ़ावा दिया जाना चाहिए।</w:t>
         <w:br/>
       </w:r>
       <w:r>
-        <w:t>निष्कर्ष: डेटा केंद्रों का विकास डिजिटल प्रगति के लिए आवश्यक है, परंतु इसे पारिस्थितिकीय स्थिरता की कीमत पर नहीं किया जा सकता। हरित कूलिंग तकनीकों और सख्त नियामक ढाँचे के माध्यम से ही डिजिटल और पर्यावरणीय लक्ष्यों में संतुलन स्थापित किया जा सकता है।</w:t>
+        <w:t>निष्कर्ष: डिजिटल संप्रभुता और आर्थिक विकास आवश्यक हैं, परंतु इनका विकास पारिस्थितिकीय मर्यादाओं और स्थानीय समुदायों के जल अधिकारों की कीमत पर नहीं होना चाहिए।</w:t>
         <w:br/>
       </w:r>
     </w:p>
@@ -260,39 +266,93 @@
         <w:rPr>
           <w:b/>
         </w:rPr>
-        <w:t>प्रश्न [10 अंक - Paper 3]: सऊदी अरब, पाकिस्तान और तुर्की के मध्य उभरते हुए रक्षा सहयोग (तथाकथित 'इस्लामिक नाटो') के भू-राजनीतिक निहितार्थों का परीक्षण कीजिए। यह गठजोड़ भारत की सुरक्षा चिंताओं को किस प्रकार प्रभावित करता है?</w:t>
+        <w:t>प्रश्न [10 अंक - Paper 1]: कृत्रिम बुद्धिमत्ता (AI) के युग में भारतीय आईटी सेवा क्षेत्र और श्रम बाजार के समक्ष क्या चुनौतियां और अवसर हैं? मुख्य आर्थिक सलाहकार (CEA) के विचारों के आलोक में चर्चा कीजिए।</w:t>
         <w:br/>
       </w:r>
       <w:r>
-        <w:t>भूमिका: हाल के वर्षों में सऊदी अरब की वित्तीय शक्ति, पाकिस्तान की सैन्य जनशक्ति और तुर्की की उन्नत रक्षा तकनीक के संयोजन से एक नया त्रिपक्षीय रक्षा समीकरण उभर रहा है, जिसे अनौपचारिक रूप से 'इस्लामिक नाटो' की संज्ञा दी जा रही है।</w:t>
+        <w:t>भूमिका: मुख्य आर्थिक सलाहकार (CEA) वी. अनंत नागेश्वरन के अनुसार, भारतीय अर्थव्यवस्था एक महत्वपूर्ण मोड़ (Inflection Point) पर है, जहां हमें एआई युग के अनुकूल अपने विकास मॉडल पर पुनर्विचार करने की आवश्यकता है।</w:t>
         <w:br/>
       </w:r>
       <w:r>
-        <w:t>मुख्य भाग: 1. **गठजोड़ का स्वरूप और पूरकता (Complementarity)**:</w:t>
+        <w:t>मुख्य भाग: 1. **श्रम बाजार के समक्ष चुनौतियां:**</w:t>
         <w:br/>
-        <w:t xml:space="preserve">   - **सऊदी अरब**: वित्तीय रूप से सुदृढ़ है परंतु उसके पास एक मजबूत और अनुभवी थल सेना का अभाव है। वह अपनी सुरक्षा के लिए बाहरी ताकतों पर निर्भर रहा है।</w:t>
+        <w:t xml:space="preserve">   - **रोजगार विस्थापन:** एआई और ऑटोमेशन के कारण पारंपरिक कोडिंग, डेटा एंट्री और ग्राहक सेवा जैसे क्षेत्रों में नौकरियों के समाप्त होने का खतरा है।</w:t>
         <w:br/>
-        <w:t xml:space="preserve">   - **पाकिस्तान**: गंभीर आर्थिक संकट से जूझ रहा है लेकिन उसके पास एक बड़ी, परमाणु-सज्जित और प्रशिक्षित सेना है।</w:t>
+        <w:t xml:space="preserve">   - **श्रम अनिश्चितता (Labor Precarity):** डिजिटल प्लेटफॉर्म श्रम को खंडित और असुरक्षित रूपों में पुनर्गठित कर रहे हैं, जिससे अनौपचारिक क्षेत्र में शोषण बढ़ सकता है।</w:t>
         <w:br/>
-        <w:t xml:space="preserve">   - **तुर्की**: नाटो (NATO) का सदस्य होने के कारण उसके पास उन्नत सैन्य-औद्योगिक आधार और ड्रोन तकनीक (जैसे बायराक्तार टीबी2) है।</w:t>
+        <w:t xml:space="preserve">   - **कौशल अंतराल:** भारतीय कार्यबल का एक बड़ा हिस्सा एआई और मशीन लर्निंग की उन्नत आवश्यकताओं के अनुरूप कुशल नहीं है।</w:t>
         <w:br/>
+        <w:t>2. **भारतीय आईटी क्षेत्र के लिए अवसर:**</w:t>
         <w:br/>
-        <w:t>2. **गठजोड़ की सीमाएं और 'एसिड टेस्ट' (Yemen Conflict Context)**:</w:t>
+        <w:t xml:space="preserve">   - **एंटरप्राइज एडैप्टेशन लेयर:** बुनियादी एआई मॉडल के प्रतिस्थापन योग्य होने के साथ ही, उन्हें उद्यमों की आवश्यकताओं के अनुरूप ढालने (Enterprise Adaptation) का कार्य मूल्यवान हो गया है। भारतीय आईटी फर्में अपने वैश्विक अनुभव का लाभ उठाकर इस क्षेत्र में अग्रणी बन सकती हैं।</w:t>
         <w:br/>
-        <w:t xml:space="preserve">   - यमन के अंसार अल्लाह (हुती) विद्रोहियों द्वारा जब सऊदी अरब पर मिसाइल और ड्रोन हमले किए गए, तब पाकिस्तान की इस गठबंधन के प्रति प्रतिबद्धता की परीक्षा हुई। पाकिस्तान अपनी घरेलू सीमाओं और ईरान के साथ संबंधों के कारण सीधे तौर पर इस युद्ध में कूदने से हिचकिचाता रहा है, जो 'मक्का पैक्ट' की सीमाओं को दर्शाता है।</w:t>
+        <w:t xml:space="preserve">   - **एडवांस्ड पैकेजिंग:** सेमीकंडक्टर फैब के बजाय एडवांस्ड पैकेजिंग में निवेश कर भारत कम पूंजी में बड़ा विनिर्माण पारिस्थितिकी तंत्र बना सकता है।</w:t>
         <w:br/>
+        <w:t>3. **रणनीतिक दृष्टिकोण (CEA की अनुशंसा):**</w:t>
         <w:br/>
-        <w:t>3. **भारत के लिए सुरक्षा एवं रणनीतिक चिंताएं**:</w:t>
+        <w:t xml:space="preserve">   - एआई का उपयोग श्रमिकों को 'प्रतिस्थापित' करने के बजाय उनकी 'उत्पादकता बढ़ाने' (Augmenting Workers) के लिए किया जाना चाहिए।</w:t>
         <w:br/>
-        <w:t xml:space="preserve">   - **सैन्य संतुलन**: तुर्की की उन्नत रक्षा तकनीक का पाकिस्तान को हस्तांतरण कश्मीर सीमा पर भारत के लिए सुरक्षा चुनौतियां बढ़ा सकता है।</w:t>
-        <w:br/>
-        <w:t xml:space="preserve">   - **राजनयिक प्रभाव**: यदि बांग्लादेश जैसे देश इस प्रकार के मंचों की ओर आकर्षित होते हैं, तो भारत के पड़ोस में भू-राजनीतिक संतुलन बिगड़ सकता है।</w:t>
-        <w:br/>
-        <w:t xml:space="preserve">   - **मध्य-पूर्व में संतुलन**: भारत के सऊदी अरब और यूएई के साथ संबंध अत्यंत मजबूत हुए हैं। इस नए त्रिपक्षीय गठजोड़ से भारत को मध्य-पूर्व में अपनी कूटनीति को बेहद सावधानी से संतुलित करना होगा।</w:t>
+        <w:t xml:space="preserve">   - मानव-इन-द-लूप (Human-in-the-loop) मॉडल को बढ़ावा देना, जहां तकनीक और मानवीय गरिमा सह-अस्तित्व में रहें।</w:t>
         <w:br/>
       </w:r>
       <w:r>
-        <w:t>निष्कर्ष: यद्यपि यह गठजोड़ आंतरिक विरोधाभासों से ग्रस्त है, तथापि भारत को अपनी रक्षा तैयारियों को मजबूत रखने और खाड़ी देशों के साथ अपने द्विपक्षीय रणनीतिक संबंधों को और गहरा करने की आवश्यकता है।</w:t>
+        <w:t>निष्कर्ष: भारत को एक ऐसे संतुलित नीतिगत ढांचे की आवश्यकता है जो तकनीकी नवाचार को बढ़ावा देने के साथ-साथ सामाजिक सुरक्षा और रोजगार की स्थिरता सुनिश्चित करे।</w:t>
+        <w:br/>
+      </w:r>
+    </w:p>
+    <w:p>
+      <w:r>
+        <w:rPr>
+          <w:b/>
+        </w:rPr>
+        <w:t>प्रश्न [5 अंक - Paper 3]: 'स्वच्छता ही सेवा-2026' अभियान के मुख्य उद्देश्यों और रणनीतियों को स्पष्ट कीजिए।</w:t>
+        <w:br/>
+      </w:r>
+      <w:r>
+        <w:t>उत्तर: 1. **उद्देश्य:** इस अभियान का मुख्य उद्देश्य देश में स्वच्छता को एक जन-आंदोलन बनाना, कचरा मुक्त भारत की परिकल्पना को साकार करना और स्वच्छता कर्मियों की गरिमा व सुरक्षा सुनिश्चित करना है।</w:t>
+        <w:br/>
+        <w:t>2. **रणनीतियां:** इसके तहत 'स्वच्छता लक्षित इकाइयां' (CTUs) की पहचान करना, जन-भागीदारी (श्रमदान) को बढ़ावा देना और एकल-उपयोग प्लास्टिक के उन्मूलन पर ध्यान केंद्रित किया जा रहा है।</w:t>
+        <w:br/>
+        <w:t>3. **विशेष पहल:** सफाई मित्रों के लिए स्वास्थ्य शिविरों का आयोजन और कल्याणकारी योजनाओं से जुड़ाव सुनिश्चित करना।</w:t>
+        <w:br/>
+      </w:r>
+    </w:p>
+    <w:p>
+      <w:r>
+        <w:rPr>
+          <w:b/>
+        </w:rPr>
+        <w:t>प्रश्न [10 अंक - Paper 3]: "इस्लामिक नाटो" की उभरती अवधारणा और सऊदी अरब-पाकिस्तान-तुर्की त्रिपक्षीय रक्षा सहयोग का भारत की भू-राजनीतिक सुरक्षा पर क्या प्रभाव पड़ सकता है? विश्लेषण कीजिए।</w:t>
+        <w:br/>
+      </w:r>
+      <w:r>
+        <w:t>भूमिका: सऊदी अरब की वित्तीय शक्ति, पाकिस्तान की सैन्य क्षमता और तुर्की की नाटो-संबद्ध उन्नत रक्षा तकनीक के संलयन से मध्य पूर्व और दक्षिण एशिया में एक नया त्रिपक्षीय रक्षा ब्लॉक उभर रहा है, जिसे अनौपचारिक रूप से 'इस्लामिक नाटो' कहा जा रहा है।</w:t>
+        <w:br/>
+      </w:r>
+      <w:r>
+        <w:t>मुख्य भाग: 1. **त्रिपक्षीय ब्लॉक के मुख्य घटक:**</w:t>
+        <w:br/>
+        <w:t xml:space="preserve">   - **सऊदी अरब:** प्रचुर वित्तीय संसाधन और इस्लामी जगत में धार्मिक नेतृत्व।</w:t>
+        <w:br/>
+        <w:t xml:space="preserve">   - **पाकिस्तान:** परमाणु हथियार संपन्न सेना और जनशक्ति।</w:t>
+        <w:br/>
+        <w:t xml:space="preserve">   - **तुर्की:** नाटो का सदस्य होने के कारण उन्नत सैन्य-औद्योगिक तकनीक और ड्रोन प्रौद्योगिकी।</w:t>
+        <w:br/>
+        <w:t>2. **भारत के लिए भू-राजनीतिक चिंताएं:**</w:t>
+        <w:br/>
+        <w:t xml:space="preserve">   - **कश्मीर मुद्दे का अंतर्राष्ट्रीयकरण:** तुर्की और पाकिस्तान द्वारा इस मंच का उपयोग कश्मीर मुद्दे पर भारत विरोधी नैरेटिव बनाने के लिए किया जा सकता है।</w:t>
+        <w:br/>
+        <w:t xml:space="preserve">   - **सामरिक संतुलन में व्यवधान:** पाकिस्तान को तुर्की से आधुनिक ड्रोन और मिसाइल तकनीक प्राप्त होने से भारत की पश्चिमी सीमा पर सुरक्षा चुनौतियां बढ़ेंगी।</w:t>
+        <w:br/>
+        <w:t xml:space="preserve">   - **मध्य पूर्व में भारत के हित:** भारत के सऊदी अरब और यूएई के साथ मजबूत होते द्विपक्षीय संबंधों में इस ब्लॉक के कारण कूटनीतिक जटिलताएं आ सकती हैं।</w:t>
+        <w:br/>
+        <w:t>3. **ब्लॉक की आंतरिक सीमाएं (एसिड टेस्ट):**</w:t>
+        <w:br/>
+        <w:t xml:space="preserve">   - यमन के हौथी (अंसार अल्लाह) विद्रोहियों द्वारा सऊदी अरब पर किए जा रहे मिसाइल और ड्रोन हमलों के समय पाकिस्तान की निष्क्रियता ने इस गठबंधन की वास्तविक सैन्य एकजुटता पर सवाल खड़े किए हैं।</w:t>
+        <w:br/>
+      </w:r>
+      <w:r>
+        <w:t>निष्कर्ष: भारत को अपनी 'पश्चिम की ओर देखो' (Link West) नीति को और मजबूत करना चाहिए तथा द्विपक्षीय रणनीतिक साझेदारियों के माध्यम से इस बहुपक्षीय ब्लॉक के संभावित प्रतिकूल प्रभावों को संतुलित करना चाहिए।</w:t>
         <w:br/>
       </w:r>
     </w:p>
@@ -309,17 +369,17 @@
         <w:rPr>
           <w:b/>
         </w:rPr>
-        <w:t>प्रश्न [5 अंक - Paper 1 - राजस्थान का इतिहास, कला एवं संस्कृति - @Rajasthan_History_Polity_Culture]: राजस्थान की प्रसिद्ध हवेलियों के संदर्भ में बच्छावतों की हवेली, रामपुरिया हवेली, गुलेच्छा हवेली और सेठिया की हवेली का ऐतिहासिक व स्थापत्य महत्व स्पष्ट कीजिए।</w:t>
+        <w:t>प्रश्न [5 अंक - Paper 1 (Unit 3: राजस्थान की कला, संस्कृति एवं स्थापत्य) - @Rajasthan_History_Polity_Culture]: राजस्थान में बच्छावतों, रामपुरिया, गुलेच्छा और सेठिया की हवेलियां कहां स्थित हैं? इनके स्थापत्य की विशेषताएं बताइए।</w:t>
         <w:br/>
       </w:r>
       <w:r>
         <w:t>उत्तर ढांचा (~50 शब्द):</w:t>
         <w:br/>
-        <w:t>1. **अवस्थिति**: ये सभी प्रसिद्ध हवेलियां राजस्थान के **बीकानेर** जिले में स्थित हैं।</w:t>
+        <w:t>1. **स्थान:** ये सभी प्रसिद्ध हवेलियां राजस्थान के **बीकानेर** जिले में स्थित हैं।</w:t>
         <w:br/>
-        <w:t>2. **स्थापत्य शैली**: ये हवेलियां लाल पत्थर (Dulmera Red Stone) से निर्मित हैं, जिन पर बारीक नक्काशी, कटवा जाली का काम और भव्य झरोखे बने हुए हैं।</w:t>
+        <w:t>2. **स्थापत्य कला:** ये हवेलियां लाल पत्थर (दुलमेरा पत्थर) से निर्मित हैं, जिन पर बारीक कटाई और जालीदार नक्काशी का उत्कृष्ट कार्य किया गया है।</w:t>
         <w:br/>
-        <w:t>3. **सांस्कृतिक महत्व**: ये बीकानेर के समृद्ध ओसवाल जैन व्यापारियों और सेठों की हवेलियां हैं, जो मध्यकालीन राजस्थानी स्थापत्य कला और भित्ति चित्रों (Fresco Paintings) का उत्कृष्ट उदाहरण प्रस्तुत करती हैं।</w:t>
+        <w:t>3. **विशेषताएं:** इनमें विशाल चौक, भित्ति चित्र (Fresco Paintings) और काष्ठ कला (लकड़ी के काम) का सुंदर समन्वय देखने को मिलता है, जो बीकानेर की समृद्ध हवेलियों की पहचान है।</w:t>
         <w:br/>
       </w:r>
     </w:p>
@@ -333,17 +393,17 @@
         <w:rPr>
           <w:b/>
         </w:rPr>
-        <w:t>प्रश्न [5 अंक - Paper 1 - राजस्थान की कला एवं संस्कृति (चित्रकला) - @Rajasthan_History_Polity_Culture]: राजस्थानी चित्रकला की 'सावर उपशैली' (Sawar Sub-school) की मुख्य विशेषताओं पर प्रकाश डालिए।</w:t>
+        <w:t>प्रश्न [5 अंक - Paper 1 (Unit 3: राजस्थान की चित्रकला शैलियां) - @Rajasthan_History_Polity_Culture]: राजस्थानी चित्रकला के वैज्ञानिक वर्गीकरण में आनंद कुमार स्वामी और डब्ल्यू.एच. ब्राउन के योगदान को स्पष्ट कीजिए।</w:t>
         <w:br/>
       </w:r>
       <w:r>
         <w:t>उत्तर ढांचा (~50 शब्द):</w:t>
         <w:br/>
-        <w:t>1. **वर्गीकरण**: सावर उपशैली का संबंध **मेवाड़ चित्रकला स्कूल (Mewar Painting School)** से है।</w:t>
+        <w:t>1. **आनंद कुमार स्वामी:** इन्होंने वर्ष 1916 में अपनी ऐतिहासिक पुस्तक **'राजपूत पेंटिंग'** लिखी। इन्होंने राजस्थानी चित्रकला का पहला वैज्ञानिक वर्गीकरण किया और इसमें पहाड़ी चित्रशैली को भी शामिल किया।</w:t>
         <w:br/>
-        <w:t>2. **विशेषताएं**: इस उपशैली पर अजमेर और मेवाड़ दोनों शैलियों का प्रभाव दिखाई देता है। इसमें स्थानीय लोक जीवन, शिकार के दृश्य और दरबारी वैभव का चित्रण प्रमुखता से किया गया है।</w:t>
+        <w:t>2. **डब्ल्यू.एच. ब्राउन:** इन्होंने अपने प्रसिद्ध ग्रंथ **'इंडियन पेंटिंग्स'** में इस भूभाग की चित्रकला के लिए सर्वप्रथम **'राजस्थानी चित्रकला'** शब्द का प्रयोग किया।</w:t>
         <w:br/>
-        <w:t>3. **रंग योजना**: इसमें पीले, लाल और हरे रंगों का बहुतायत से प्रयोग हुआ है, जो मेवाड़ शैली की मूल पहचान है।</w:t>
+        <w:t>3. **महत्व:** इन दोनों विद्वानों के कार्यों ने राजस्थानी चित्रकला को वैश्विक स्तर पर एक विशिष्ट पहचान और अकादमिक मान्यता प्रदान की।</w:t>
         <w:br/>
       </w:r>
     </w:p>
@@ -357,17 +417,17 @@
         <w:rPr>
           <w:b/>
         </w:rPr>
-        <w:t>प्रश्न [5 अंक - Paper 1 - राजस्थान का स्वतंत्रता आंदोलन एवं राजनीतिक जनजागरण - @Rajasthan_History_Polity_Culture]: राजस्थान के स्वतंत्रता आंदोलन में जयनारायण व्यास के योगदान और उनके समाचार पत्र 'आगीबाण' के महत्व की विवेचना कीजिए।</w:t>
+        <w:t>प्रश्न [5 अंक - Paper 1 (Unit 3: राजस्थान की चित्रकला शैलियां) - @Rajasthan_History_Polity_Culture]: चित्रकला की 'सावर उपशैली' का संबंध किस स्कूल से है? इसकी प्रमुख विशेषताएं लिखिए।</w:t>
         <w:br/>
       </w:r>
       <w:r>
         <w:t>उत्तर ढांचा (~50 शब्द):</w:t>
         <w:br/>
-        <w:t>1. **लोकनायक**: जयनारायण व्यास को राजस्थान में 'लोकनायक' और 'शेर-ए-राजस्थान' के नाम से जाना जाता है। उन्होंने मारवाड़ प्रजामंडल के माध्यम से उत्तरदायी शासन की स्थापना के लिए संघर्ष किया।</w:t>
+        <w:t>1. **वर्गीकरण व संबंध:** सावर उपशैली का संबंध **मेवाड़ पेंटिंग स्कूल** (Mewar Painting School) से है। यह अजमेर-भीलवाड़ा सीमा के पास स्थित सावर ठिकाने की स्थानीय शैली है।</w:t>
         <w:br/>
-        <w:t>2. **आगीबाण (1932)**: यह ब्यावर से राजस्थानी भाषा में प्रकाशित होने वाला **प्रथम राजनीतिक समाचार पत्र** था।</w:t>
+        <w:t>2. **विशेषताएं:** इस शैली पर मेवाड़ शैली का गहरा प्रभाव है, जिसमें चटक रंगों (लाल, पीला) का प्रयोग, स्थानीय लोक जीवन का चित्रण और शिकार के दृश्यों की प्रधानता है।</w:t>
         <w:br/>
-        <w:t>3. **महत्व**: इसके माध्यम से व्यास जी ने जागीरदारी उत्पीड़न, सामंती अत्याचारों और ब्रिटिश नीतियों के खिलाफ जन-जागृति पैदा की।</w:t>
+        <w:t>3. **महत्व:** यह उपशैली मेवाड़ स्कूल की विविधता और इसके क्षेत्रीय विस्तार को प्रदर्शित करती है।</w:t>
         <w:br/>
       </w:r>
     </w:p>
@@ -381,17 +441,41 @@
         <w:rPr>
           <w:b/>
         </w:rPr>
-        <w:t>प्रश्न [5 अंक - Paper 1 - राजस्थान के प्रजामंडल आंदोलन - @Rajasthan_History_Polity_Culture]: मेवाड़ प्रजामंडल की स्थापना और इसके मुख्य उद्देश्यों को संक्षेप में समझाइए।</w:t>
+        <w:t>प्रश्न [5 अंक - Paper 1 (Unit 1: राजस्थान का इतिहास एवं स्वतंत्रता आंदोलन) - @Rajasthan_History_Polity_Culture]: मेवाड़ प्रजामंडल की स्थापना कब, किसके द्वारा और किस उद्देश्य से की गई थी?</w:t>
         <w:br/>
       </w:r>
       <w:r>
         <w:t>उत्तर ढांचा (~50 शब्द):</w:t>
         <w:br/>
-        <w:t>1. **स्थापना**: इसकी स्थापना **24 अप्रैल 1938** को **माणिक्य लाल वर्मा** के प्रयासों से बलवंत सिंह मेहता की अध्यक्षता में उदयपुर में की गई थी।</w:t>
+        <w:t>1. **स्थापना व संस्थापक:** मेवाड़ प्रजामंडल की स्थापना **24 अप्रैल, 1938** को **माणिक्य लाल वर्मा** के प्रयासों से उदयपुर में की गई थी। इसके प्रथम अध्यक्ष बलवंत सिंह मेहता थे।</w:t>
         <w:br/>
-        <w:t>2. **मुख्य उद्देश्य**: मेवाड़ रियासत में महाराजा की छत्रछाया में उत्तरदायी शासन (Responsible Government) की स्थापना करना और नागरिक अधिकारों की रक्षा करना।</w:t>
+        <w:t>2. **मुख्य उद्देश्य:** मेवाड़ रियासत में उत्तरदायी शासन की स्थापना करना, नागरिक अधिकारों की रक्षा करना और जागीरदारी दमन व बेगार प्रथा के खिलाफ आवाज उठाना।</w:t>
         <w:br/>
-        <w:t>3. **योगदान**: इसने बेगार प्रथा, जागीरदार विरोधी आंदोलनों और भारत छोड़ो आंदोलन में सक्रिय भूमिका निभाई।</w:t>
+        <w:t>3. **ऐतिहासिक महत्व:** इसने बिजोलिया और बेगू किसान आंदोलनों को राजनीतिक दिशा दी और भारत छोड़ो आंदोलन में सक्रिय भूमिका निभाई।</w:t>
+        <w:br/>
+      </w:r>
+    </w:p>
+    <w:p>
+      <w:r>
+        <w:t>----------------------------------------</w:t>
+      </w:r>
+    </w:p>
+    <w:p>
+      <w:r>
+        <w:rPr>
+          <w:b/>
+        </w:rPr>
+        <w:t>प्रश्न [5 अंक - Paper 1 (Unit 1: राजस्थान के इतिहास के स्रोत एवं पुरातात्विक स्थल) - @Rajasthan_History_Polity_Culture]: अजमेर के 'राजपूताना संग्रहालय' के इतिहास और इसके प्रथम संग्रहाध्यक्ष के योगदान पर प्रकाश डालिए।</w:t>
+        <w:br/>
+      </w:r>
+      <w:r>
+        <w:t>उत्तर ढांचा (~50 शब्द):</w:t>
+        <w:br/>
+        <w:t>1. **स्थापना:** अजमेर के ऐतिहासिक अकबर के किले (मैगजीन दुर्ग) में वर्ष 1908 में 'राजपूताना संग्रहालय' की स्थापना की गई थी।</w:t>
+        <w:br/>
+        <w:t>2. **प्रथम संग्रहाध्यक्ष:** प्रसिद्ध इतिहासकार और पुरातत्वविद् **गौरीशंकर हीराचंद ओझा** को इस संग्रहालय का पहला संग्रहाध्यक्ष (Curator) बनाया गया था।</w:t>
+        <w:br/>
+        <w:t>3. **योगदान:** ओझा जी ने राजपूताना के इतिहास, प्राचीन सिक्कों, शिलालेखों और मूर्तियों के संरक्षण व वर्गीकरण में अमूल्य योगदान दिया, जो आज भी शोधकर्ताओं के लिए मार्गदर्शक है।</w:t>
         <w:br/>
       </w:r>
     </w:p>

</xml_diff>

<commit_message>
Fix daily VM notes automation: eliminate git pull rebase errors, register local 12PM Windows scheduler, optimize cloud cron and add 2026-09-18 notes
</commit_message>
<xml_diff>
--- a/RPSC_UPSC_Daily_AI_Agent/Output_Notes/RAS_UPSC_Notes_2026-09-17.docx
+++ b/RPSC_UPSC_Daily_AI_Agent/Output_Notes/RAS_UPSC_Notes_2026-09-17.docx
@@ -35,10 +35,10 @@
         <w:rPr>
           <w:b/>
         </w:rPr>
-        <w:t xml:space="preserve">• [वित्त मंत्रालय 18 और 19 सितंबर 2026 को नई दिल्ली म] </w:t>
+        <w:t xml:space="preserve">• [प्रधानमंत्री ने समावेशी शासन और प्रभावी कार्यान्वय] </w:t>
       </w:r>
       <w:r>
-        <w:t>वित्त मंत्रालय 18 और 19 सितंबर 2026 को नई दिल्ली में "विकसित भारत की ओर भारत की यात्रा के लिए वित्तपोषण" विषय पर राज्य वित्त मंत्रियों और वित्त सचिवों के एक सम्मेलन का आयोजन करेगा</w:t>
+        <w:t>प्रधानमंत्री ने समावेशी शासन और प्रभावी कार्यान्वयन पर प्रकाश डालने वाला एक लेख साझा किया</w:t>
       </w:r>
     </w:p>
     <w:p>
@@ -46,10 +46,10 @@
         <w:rPr>
           <w:b/>
         </w:rPr>
-        <w:t xml:space="preserve">• [PM मोदी के जन्मदिन पर श्री शिवराज सिंह चौहान ने सर] </w:t>
+        <w:t xml:space="preserve">• [‘मास्टर सर्कुलर्स और सतर्कता मैनुअल 2026’ पर दक्षि] </w:t>
       </w:r>
       <w:r>
-        <w:t>PM मोदी के जन्मदिन पर श्री शिवराज सिंह चौहान ने सरपंचों के साथ किया पौधरोपण, VB–G RAM G वर्कशॉप को भी किया संबोधित</w:t>
+        <w:t>‘मास्टर सर्कुलर्स और सतर्कता मैनुअल 2026’ पर दक्षिण क्षेत्र के सतर्कता अधिकारियों का प्रशिक्षण कार्यक्रम आयोजित</w:t>
       </w:r>
     </w:p>
     <w:p>
@@ -57,10 +57,10 @@
         <w:rPr>
           <w:b/>
         </w:rPr>
-        <w:t xml:space="preserve">• [रक्षा विभाग स्वच्छता अभियान के तहत स्वच्छता और कार] </w:t>
+        <w:t xml:space="preserve">• [शंघाई सहयोग संगठन देशों के आर्थिक और विदेश व्यापार] </w:t>
       </w:r>
       <w:r>
-        <w:t>रक्षा विभाग स्वच्छता अभियान के तहत स्वच्छता और कार्यस्थल सुधार संबंधी पहलों को तेज कर रहा है</w:t>
+        <w:t>शंघाई सहयोग संगठन देशों के आर्थिक और विदेश व्यापार मंत्रियों की 25वीं बैठक ताजिकिस्तान में संपन्न</w:t>
       </w:r>
     </w:p>
     <w:p>
@@ -68,10 +68,10 @@
         <w:rPr>
           <w:b/>
         </w:rPr>
-        <w:t xml:space="preserve">• [वित्तीय बाधाओं से लेकर शैक्षणिक प्रगति तक: एनएफएसस] </w:t>
+        <w:t xml:space="preserve">• [केंद्रीय संचार मंत्री श्री ज्योतिरादित्य एम. सिंधि] </w:t>
       </w:r>
       <w:r>
-        <w:t>वित्तीय बाधाओं से लेकर शैक्षणिक प्रगति तक: एनएफएससी के साथ समीर मखाल का सफर</w:t>
+        <w:t>केंद्रीय संचार मंत्री श्री ज्योतिरादित्य एम. सिंधिया ने मध्य प्रदेश के गुना प्रधान डाकघर के जीर्णोद्धार का उद्घाटन किया</w:t>
       </w:r>
     </w:p>
     <w:p>
@@ -79,10 +79,10 @@
         <w:rPr>
           <w:b/>
         </w:rPr>
-        <w:t xml:space="preserve">• [आत्मनिर्भर भारत: बेंगलुरु में रक्षा मंत्री और नागर] </w:t>
+        <w:t xml:space="preserve">• [एनएचआरसी, भारत ने हरियाणा के पलवल में अपने घर के प] </w:t>
       </w:r>
       <w:r>
-        <w:t>आत्मनिर्भर भारत: बेंगलुरु में रक्षा मंत्री और नागर विमानन मंत्री की उपस्थिति में, एचएएल भारतीय वायु सेना को एलसीए तेजस फ्री-ऑक्शन ट्विन सीटर ट्रेनर और एचटीटी 40 बेसिक ट्रेनर विमान तथा पीएचएल को ध्रुव एनजी हेलीकॉप्टर सौंपेगा</w:t>
+        <w:t>एनएचआरसी, भारत ने हरियाणा के पलवल में अपने घर के पास एक खुले मैनहोल में गिरने से चार साल की बच्ची की मौत की कथित घटना का स्वत: संज्ञान लिया</w:t>
       </w:r>
     </w:p>
     <w:p>
@@ -90,10 +90,10 @@
         <w:rPr>
           <w:b/>
         </w:rPr>
-        <w:t xml:space="preserve">• [भारतीय रक्षा अभियंता सेवा ने 77वां स्थापना दिवस मन] </w:t>
+        <w:t xml:space="preserve">• [इस्पात मंत्रालय 24 सितंबर को इस्पात आयात संबंधी मु] </w:t>
       </w:r>
       <w:r>
-        <w:t>भारतीय रक्षा अभियंता सेवा ने 77वां स्थापना दिवस मनाया</w:t>
+        <w:t>इस्पात मंत्रालय 24 सितंबर को इस्पात आयात संबंधी मुद्दों पर एक खुली बैठक आयोजित करेगा</w:t>
       </w:r>
     </w:p>
     <w:p>
@@ -144,6 +144,494 @@
       <w:r>
         <w:t>निष्कर्ष: प्रजामण्डल आंदोलनों ने राजस्थान के एकीकरण और लोकतांत्रिक चेतना की मजबूत नींव रखी।</w:t>
         <w:br/>
+      </w:r>
+    </w:p>
+    <w:p>
+      <w:pPr>
+        <w:pStyle w:val="Heading1"/>
+      </w:pPr>
+      <w:r>
+        <w:t>3. टेलीग्राम चैनल दैनिक मॉडल प्रश्नोत्तर व नोट्स (~50 शब्द प्रारूप)</w:t>
+      </w:r>
+    </w:p>
+    <w:p>
+      <w:r>
+        <w:rPr>
+          <w:b/>
+        </w:rPr>
+        <w:t>प्रश्न [5 अंक - Paper 1 (राजस्थान इतिहास, कला व संस्कृति) - @Rajasthan_History_Polity_Culture]: एकी आंदोलन के प्रवर्तक कौन थे ?</w:t>
+        <w:br/>
+      </w:r>
+      <w:r>
+        <w:t>उत्तर ढांचा (~50 शब्द):</w:t>
+        <w:br/>
+        <w:t>1. मुख्य तथ्य व अवधारणा: एकी आंदोलन के प्रवर्तक कौन थे ? का संबंध राजस्थान के विशिष्ट ऐतिहासिक व समसामयिक संदर्भ से है।</w:t>
+        <w:br/>
+        <w:t>2. विस्तृत आयाम व विवरण: [17% गुरु गोविंद गिरी 78% मोतीलाल तेजावत 4% संत मावजी 0% रामनारायण चौधरी](https://t.me/Rajasthan_History_Polity_Culture/23808), September 17, (https://t.me/Rajasthan_History_Polity_Culture)</w:t>
+        <w:br/>
+        <w:t>3. परीक्षा प्रासंगिकता: RAS मुख्य परीक्षा (Paper 1/2/3) के दृष्टिकोण से अनिवार्य अध्ययन बिंदु।</w:t>
+        <w:br/>
+      </w:r>
+    </w:p>
+    <w:p>
+      <w:r>
+        <w:t>----------------------------------------</w:t>
+      </w:r>
+    </w:p>
+    <w:p>
+      <w:r>
+        <w:rPr>
+          <w:b/>
+        </w:rPr>
+        <w:t>प्रश्न [5 अंक - Paper 1 (राजस्थान इतिहास, कला व संस्कृति) - @Rajasthan_History_Polity_Culture]: अशोका लीलेंड फैक्ट्री राजस्थान में कहाँ स्थित है-</w:t>
+        <w:br/>
+      </w:r>
+      <w:r>
+        <w:t>उत्तर ढांचा (~50 शब्द):</w:t>
+        <w:br/>
+        <w:t>1. मुख्य तथ्य व अवधारणा: अशोका लीलेंड फैक्ट्री राजस्थान में कहाँ स्थित है- का संबंध राजस्थान के विशिष्ट ऐतिहासिक व समसामयिक संदर्भ से है।</w:t>
+        <w:br/>
+        <w:t>2. विस्तृत आयाम व विवरण: [CET-11.02.2023 (S-II)], [9% जोधपुर 29% कोटा 11% जयपुर 50% अलवर](https://t.me/Rajasthan_History_Polity_Culture/23809), September 17</w:t>
+        <w:br/>
+        <w:t>3. परीक्षा प्रासंगिकता: RAS मुख्य परीक्षा (Paper 1/2/3) के दृष्टिकोण से अनिवार्य अध्ययन बिंदु।</w:t>
+        <w:br/>
+      </w:r>
+    </w:p>
+    <w:p>
+      <w:r>
+        <w:t>----------------------------------------</w:t>
+      </w:r>
+    </w:p>
+    <w:p>
+      <w:r>
+        <w:rPr>
+          <w:b/>
+        </w:rPr>
+        <w:t>प्रश्न [5 अंक - Paper 1 (राजस्थान इतिहास, कला व संस्कृति) - @Rajasthan_History_Polity_Culture]: निम्नलिखित में से कौनसा एक (उद्योग - अवस्थिति) सुमेलित नहीं है?</w:t>
+        <w:br/>
+      </w:r>
+      <w:r>
+        <w:t>उत्तर ढांचा (~50 शब्द):</w:t>
+        <w:br/>
+        <w:t>1. मुख्य तथ्य व अवधारणा: निम्नलिखित में से कौनसा एक (उद्योग - अवस्थिति) सुमेलित नहीं है? का संबंध राजस्थान के विशिष्ट ऐतिहासिक व समसामयिक संदर्भ से है।</w:t>
+        <w:br/>
+        <w:t>2. विस्तृत आयाम व विवरण: (Asst. Pro. Geo. - 2024), [4% हाइटेक प्रिसिजन ग्लास फैक्ट्री - धौलपुर 63% राजस्थान इलेक्ट्रॉनिक्स कॉरपोरेशन - उदयपुर 21% दी मेवाड़ शुगर मिल्स - भूपालसागर 12% राजस्थान स्पिनिंग एवं वीविंग मिल्स गुलाबपुरा](https://t.me/Rajasthan_History_Polity_Culture/23810), September 17</w:t>
+        <w:br/>
+        <w:t>3. परीक्षा प्रासंगिकता: RAS मुख्य परीक्षा (Paper 1/2/3) के दृष्टिकोण से अनिवार्य अध्ययन बिंदु।</w:t>
+        <w:br/>
+      </w:r>
+    </w:p>
+    <w:p>
+      <w:r>
+        <w:t>----------------------------------------</w:t>
+      </w:r>
+    </w:p>
+    <w:p>
+      <w:r>
+        <w:rPr>
+          <w:b/>
+        </w:rPr>
+        <w:t>प्रश्न [5 अंक - Paper 1 (राजस्थान इतिहास, कला व संस्कृति) - @Rajasthan_History_Polity_Culture]: कौनसा सुमेलित नहीं है?</w:t>
+        <w:br/>
+      </w:r>
+      <w:r>
+        <w:t>उत्तर ढांचा (~50 शब्द):</w:t>
+        <w:br/>
+        <w:t>1. मुख्य तथ्य व अवधारणा: कौनसा सुमेलित नहीं है? का संबंध राजस्थान के विशिष्ट ऐतिहासिक व समसामयिक संदर्भ से है।</w:t>
+        <w:br/>
+        <w:t>2. विस्तृत आयाम व विवरण: [Asst. Jailer 15.03.2016], [1% वस्त्र - भीलवाड़ा 64% उर्वरक - मोड़क 13% सीमेन्ट - निम्बाहेड़ा 22% सोडियम सल्फेट - डीडवाना](https://t.me/Rajasthan_History_Polity_Culture/23811), _**❤**_ 3</w:t>
+        <w:br/>
+        <w:t>3. परीक्षा प्रासंगिकता: RAS मुख्य परीक्षा (Paper 1/2/3) के दृष्टिकोण से अनिवार्य अध्ययन बिंदु।</w:t>
+        <w:br/>
+      </w:r>
+    </w:p>
+    <w:p>
+      <w:r>
+        <w:t>----------------------------------------</w:t>
+      </w:r>
+    </w:p>
+    <w:p>
+      <w:r>
+        <w:rPr>
+          <w:b/>
+        </w:rPr>
+        <w:t>प्रश्न [5 अंक - Paper 1 (राजस्थान इतिहास, कला व संस्कृति) - @Rajasthan_History_Polity_Culture]: सुमेलित नहीं है? [I Grade Teacher (GK) -15.10.2022 ]</w:t>
+        <w:br/>
+      </w:r>
+      <w:r>
+        <w:t>उत्तर ढांचा (~50 शब्द):</w:t>
+        <w:br/>
+        <w:t>1. मुख्य तथ्य व अवधारणा: सुमेलित नहीं है? [I Grade Teacher (GK) -15.10.2022 ] का संबंध राजस्थान के विशिष्ट ऐतिहासिक व समसामयिक संदर्भ से है।</w:t>
+        <w:br/>
+        <w:t>2. विस्तृत आयाम व विवरण: [9% सोडियम सल्फेट - डीडवाना 16% ग्लास (काँच) - धौलपुर 20% उर्वरक - गढ़ेपान 56% वॉटर मीटर - भिवाड़ी](https://t.me/Rajasthan_History_Polity_Culture/23812), September 17, (https://t.me/Rajasthan_History_Polity_Culture)</w:t>
+        <w:br/>
+        <w:t>3. परीक्षा प्रासंगिकता: RAS मुख्य परीक्षा (Paper 1/2/3) के दृष्टिकोण से अनिवार्य अध्ययन बिंदु।</w:t>
+        <w:br/>
+      </w:r>
+    </w:p>
+    <w:p>
+      <w:r>
+        <w:t>----------------------------------------</w:t>
+      </w:r>
+    </w:p>
+    <w:p>
+      <w:r>
+        <w:rPr>
+          <w:b/>
+        </w:rPr>
+        <w:t>प्रश्न [5 अंक - Paper 1 (राजस्थान इतिहास, कला व संस्कृति) - @Rajasthan_History_Polity_Culture]: [](https://t.me/Rajasthan_History_Polity_Culture/23814)</w:t>
+        <w:br/>
+      </w:r>
+      <w:r>
+        <w:t>उत्तर ढांचा (~50 शब्द):</w:t>
+        <w:br/>
+        <w:t>1. मुख्य तथ्य व अवधारणा: [](https://t.me/Rajasthan_History_Polity_Culture/23814) का संबंध राजस्थान के विशिष्ट ऐतिहासिक व समसामयिक संदर्भ से है।</w:t>
+        <w:br/>
+        <w:t>2. विस्तृत आयाम व विवरण: _**🏆**_ RAJASTHAN CET EXAM 2026 _**🏆**_, _**✨**_ एक Exam — अनेक सरकारी नौकरियों का सुनहरा अवसर, _**✔️**_ Full Length Mock Tests</w:t>
+        <w:br/>
+        <w:t>3. परीक्षा प्रासंगिकता: RAS मुख्य परीक्षा (Paper 1/2/3) के दृष्टिकोण से अनिवार्य अध्ययन बिंदु।</w:t>
+        <w:br/>
+      </w:r>
+    </w:p>
+    <w:p>
+      <w:r>
+        <w:t>----------------------------------------</w:t>
+      </w:r>
+    </w:p>
+    <w:p>
+      <w:r>
+        <w:rPr>
+          <w:b/>
+        </w:rPr>
+        <w:t>प्रश्न [5 अंक - Paper 1 (राजस्थान इतिहास, कला व संस्कृति) - @Rajasthan_History_Polity_Culture]: "भाखड़ा नांगल" से राजस्थान में कितनी हिस्सेदारी है ?</w:t>
+        <w:br/>
+      </w:r>
+      <w:r>
+        <w:t>उत्तर ढांचा (~50 शब्द):</w:t>
+        <w:br/>
+        <w:t>1. मुख्य तथ्य व अवधारणा: "भाखड़ा नांगल" से राजस्थान में कितनी हिस्सेदारी है ? का संबंध राजस्थान के विशिष्ट ऐतिहासिक व समसामयिक संदर्भ से है।</w:t>
+        <w:br/>
+        <w:t>2. विस्तृत आयाम व विवरण: [ RPSC Van rakshak Exam....२०२०]_**❤️**_, [12% 17.2% 66% 15.22% 16% 21.3% 6% 9.11%](https://t.me/Rajasthan_History_Polity_Culture/23815), September 18</w:t>
+        <w:br/>
+        <w:t>3. परीक्षा प्रासंगिकता: RAS मुख्य परीक्षा (Paper 1/2/3) के दृष्टिकोण से अनिवार्य अध्ययन बिंदु।</w:t>
+        <w:br/>
+      </w:r>
+    </w:p>
+    <w:p>
+      <w:r>
+        <w:t>----------------------------------------</w:t>
+      </w:r>
+    </w:p>
+    <w:p>
+      <w:r>
+        <w:rPr>
+          <w:b/>
+        </w:rPr>
+        <w:t>प्रश्न [5 अंक - Paper 1 (राजस्थान इतिहास, कला व संस्कृति) - @Rajasthan_History_Polity_Culture]: कौनसी श्रेणी प्रशासनिक दृष्टि से राजस्थान के वनों को श्रेणी नही है?</w:t>
+        <w:br/>
+      </w:r>
+      <w:r>
+        <w:t>उत्तर ढांचा (~50 शब्द):</w:t>
+        <w:br/>
+        <w:t>1. मुख्य तथ्य व अवधारणा: कौनसी श्रेणी प्रशासनिक दृष्टि से राजस्थान के वनों को श्रेणी नही है? का संबंध राजस्थान के विशिष्ट ऐतिहासिक व समसामयिक संदर्भ से है।</w:t>
+        <w:br/>
+        <w:t>2. विस्तृत आयाम व विवरण: [3rd grade L 1........२०२३]_**❤️**_, [18% सुरक्षित वन 13% आरक्षित वन 53% वर्गीकृत वन 16% अवर्गीकृत वन](https://t.me/Rajasthan_History_Polity_Culture/23816), September 18</w:t>
+        <w:br/>
+        <w:t>3. परीक्षा प्रासंगिकता: RAS मुख्य परीक्षा (Paper 1/2/3) के दृष्टिकोण से अनिवार्य अध्ययन बिंदु।</w:t>
+        <w:br/>
+      </w:r>
+    </w:p>
+    <w:p>
+      <w:r>
+        <w:t>----------------------------------------</w:t>
+      </w:r>
+    </w:p>
+    <w:p>
+      <w:r>
+        <w:rPr>
+          <w:b/>
+        </w:rPr>
+        <w:t>प्रश्न [5 अंक - Paper 1 (राजस्थान इतिहास, कला व संस्कृति) - @Rajasthan_History_Polity_Culture]: निम्नलिखित में से कौनसे वन सर्वाधिक क्षैत्र में फैले हुए हैं?</w:t>
+        <w:br/>
+      </w:r>
+      <w:r>
+        <w:t>उत्तर ढांचा (~50 शब्द):</w:t>
+        <w:br/>
+        <w:t>1. मुख्य तथ्य व अवधारणा: निम्नलिखित में से कौनसे वन सर्वाधिक क्षैत्र में फैले हुए हैं? का संबंध राजस्थान के विशिष्ट ऐतिहासिक व समसामयिक संदर्भ से है।</w:t>
+        <w:br/>
+        <w:t>2. विस्तृत आयाम व विवरण: [Ldc.......२०१८]_**❤️**_, [32% उष्ण कटिबंधीय पतझड़ 26% मिश्रित पतझड़ 34% उपोष्ण कटिबंधीय सदाबहार 8% शुष्क सागवान](https://t.me/Rajasthan_History_Polity_Culture/23817), _**❤**_ 1</w:t>
+        <w:br/>
+        <w:t>3. परीक्षा प्रासंगिकता: RAS मुख्य परीक्षा (Paper 1/2/3) के दृष्टिकोण से अनिवार्य अध्ययन बिंदु।</w:t>
+        <w:br/>
+      </w:r>
+    </w:p>
+    <w:p>
+      <w:r>
+        <w:t>----------------------------------------</w:t>
+      </w:r>
+    </w:p>
+    <w:p>
+      <w:r>
+        <w:rPr>
+          <w:b/>
+        </w:rPr>
+        <w:t>प्रश्न [5 अंक - Paper 1 (राजस्थान इतिहास, कला व संस्कृति) - @Rajasthan_History_Polity_Culture]: कोनसी घास राजस्थान के पश्चिमी जिलों में नही पाई जाती है?</w:t>
+        <w:br/>
+      </w:r>
+      <w:r>
+        <w:t>उत्तर ढांचा (~50 शब्द):</w:t>
+        <w:br/>
+        <w:t>1. मुख्य तथ्य व अवधारणा: कोनसी घास राजस्थान के पश्चिमी जिलों में नही पाई जाती है? का संबंध राजस्थान के विशिष्ट ऐतिहासिक व समसामयिक संदर्भ से है।</w:t>
+        <w:br/>
+        <w:t>2. विस्तृत आयाम व विवरण: [Jen diploma......२०२०]_**❤️**_, [51% लाणा 29% सेवण 8% धामण 13% करड़](https://t.me/Rajasthan_History_Polity_Culture/23818), September 18</w:t>
+        <w:br/>
+        <w:t>3. परीक्षा प्रासंगिकता: RAS मुख्य परीक्षा (Paper 1/2/3) के दृष्टिकोण से अनिवार्य अध्ययन बिंदु।</w:t>
+        <w:br/>
+      </w:r>
+    </w:p>
+    <w:p>
+      <w:r>
+        <w:t>----------------------------------------</w:t>
+      </w:r>
+    </w:p>
+    <w:p>
+      <w:r>
+        <w:rPr>
+          <w:b/>
+        </w:rPr>
+        <w:t>प्रश्न [5 अंक - Paper 1 (राजस्थान इतिहास, कला व संस्कृति) - @Rajasthan_History_Polity_Culture]: राजपूताना के रियासती आन्दोलन के दौरान प्रसिद्ध लोकनायक गायिक कौन था</w:t>
+        <w:br/>
+      </w:r>
+      <w:r>
+        <w:t>उत्तर ढांचा (~50 शब्द):</w:t>
+        <w:br/>
+        <w:t>1. मुख्य तथ्य व अवधारणा: राजपूताना के रियासती आन्दोलन के दौरान प्रसिद्ध लोकनायक गायिक कौन था का संबंध राजस्थान के विशिष्ट ऐतिहासिक व समसामयिक संदर्भ से है।</w:t>
+        <w:br/>
+        <w:t>2. विस्तृत आयाम व विवरण: [36% गणेशीलाल व्यास 37% राणा बाई 19% चंदबरदाई 8% पी. के. मिश्रा](https://t.me/Rajasthan_History_Polity_Culture/23819), September 18, (https://t.me/Rajasthan_History_Polity_Culture)</w:t>
+        <w:br/>
+        <w:t>3. परीक्षा प्रासंगिकता: RAS मुख्य परीक्षा (Paper 1/2/3) के दृष्टिकोण से अनिवार्य अध्ययन बिंदु।</w:t>
+        <w:br/>
+      </w:r>
+    </w:p>
+    <w:p>
+      <w:r>
+        <w:t>----------------------------------------</w:t>
+      </w:r>
+    </w:p>
+    <w:p>
+      <w:r>
+        <w:rPr>
+          <w:b/>
+        </w:rPr>
+        <w:t>प्रश्न [5 अंक - Paper 1 (राजस्थान इतिहास, कला व संस्कृति) - @Rajasthan_History_Polity_Culture]: लोकगीत लोगों की भाषा है, वे हमारी संस्कृति के संरक्षक है।' यह किसका कथन है-</w:t>
+        <w:br/>
+      </w:r>
+      <w:r>
+        <w:t>उत्तर ढांचा (~50 शब्द):</w:t>
+        <w:br/>
+        <w:t>1. मुख्य तथ्य व अवधारणा: लोकगीत लोगों की भाषा है, वे हमारी संस्कृति के संरक्षक है।' यह किसका कथन है- का संबंध राजस्थान के विशिष्ट ऐतिहासिक व समसामयिक संदर्भ से है।</w:t>
+        <w:br/>
+        <w:t>2. विस्तृत आयाम व विवरण: [23% देवेन्द्र सत्यार्थी 23% सत्येन्द्र त्रिपाठी 26% डॉ. जेतनारायण शास्त्री 28% महात्मा गांधी](https://t.me/Rajasthan_History_Polity_Culture/23820), September 18, (https://t.me/Rajasthan_History_Polity_Culture)</w:t>
+        <w:br/>
+        <w:t>3. परीक्षा प्रासंगिकता: RAS मुख्य परीक्षा (Paper 1/2/3) के दृष्टिकोण से अनिवार्य अध्ययन बिंदु।</w:t>
+        <w:br/>
+      </w:r>
+    </w:p>
+    <w:p>
+      <w:r>
+        <w:t>----------------------------------------</w:t>
+      </w:r>
+    </w:p>
+    <w:p>
+      <w:r>
+        <w:rPr>
+          <w:b/>
+        </w:rPr>
+        <w:t>प्रश्न [5 अंक - Paper 1 (राजस्थान इतिहास, कला व संस्कृति) - @Rajasthan_History_Polity_Culture]: रतवाई लोक गीत किस क्षेत्र में गाए जाते हैं?</w:t>
+        <w:br/>
+      </w:r>
+      <w:r>
+        <w:t>उत्तर ढांचा (~50 शब्द):</w:t>
+        <w:br/>
+        <w:t>1. मुख्य तथ्य व अवधारणा: रतवाई लोक गीत किस क्षेत्र में गाए जाते हैं? का संबंध राजस्थान के विशिष्ट ऐतिहासिक व समसामयिक संदर्भ से है।</w:t>
+        <w:br/>
+        <w:t>2. विस्तृत आयाम व विवरण: [8% मेवाड़ 30% मारवाड़ 57% मेवात 5% हाड़ौती](https://t.me/Rajasthan_History_Polity_Culture/23821), September 18, (https://t.me/Rajasthan_History_Polity_Culture)</w:t>
+        <w:br/>
+        <w:t>3. परीक्षा प्रासंगिकता: RAS मुख्य परीक्षा (Paper 1/2/3) के दृष्टिकोण से अनिवार्य अध्ययन बिंदु।</w:t>
+        <w:br/>
+      </w:r>
+    </w:p>
+    <w:p>
+      <w:r>
+        <w:t>----------------------------------------</w:t>
+      </w:r>
+    </w:p>
+    <w:p>
+      <w:r>
+        <w:rPr>
+          <w:b/>
+        </w:rPr>
+        <w:t>प्रश्न [5 अंक - Paper 1 (राजस्थान इतिहास, कला व संस्कृति) - @Rajasthan_History_Polity_Culture]: राजस्थान का वह संगीतज्ञ जिसके विषय में किंवदन्ती है कि उसने एक राग से पत्थर को पिघला दिया था-</w:t>
+        <w:br/>
+      </w:r>
+      <w:r>
+        <w:t>उत्तर ढांचा (~50 शब्द):</w:t>
+        <w:br/>
+        <w:t>1. मुख्य तथ्य व अवधारणा: राजस्थान का वह संगीतज्ञ जिसके विषय में किंवदन्ती है कि उसने एक राग से पत्थर को पिघला दिया था- का संबंध राजस्थान के विशिष्ट ऐतिहासिक व समसामयिक संदर्भ से है।</w:t>
+        <w:br/>
+        <w:t>2. विस्तृत आयाम व विवरण: [26% हरिसिंह 25% मोहनलाल 29% कुशालीराम 20% ख्यालीराम](https://t.me/Rajasthan_History_Polity_Culture/23822), September 18</w:t>
+        <w:br/>
+        <w:t>3. परीक्षा प्रासंगिकता: RAS मुख्य परीक्षा (Paper 1/2/3) के दृष्टिकोण से अनिवार्य अध्ययन बिंदु।</w:t>
+        <w:br/>
+      </w:r>
+    </w:p>
+    <w:p>
+      <w:r>
+        <w:t>----------------------------------------</w:t>
+      </w:r>
+    </w:p>
+    <w:p>
+      <w:r>
+        <w:rPr>
+          <w:b/>
+        </w:rPr>
+        <w:t>प्रश्न [5 अंक - Paper 1 (राजस्थान इतिहास, कला व संस्कृति) - @Rajasthan_GK_Daily]: [22% तंवर 23% सांखला 32% राठौड़ 23% चौहान](https://t.me/Rajasthan_GK_daily/370)</w:t>
+        <w:br/>
+      </w:r>
+      <w:r>
+        <w:t>उत्तर ढांचा (~50 शब्द):</w:t>
+        <w:br/>
+        <w:t>1. मुख्य तथ्य व अवधारणा: [22% तंवर 23% सांखला 32% राठौड़ 23% चौहान](https://t.me/Rajasthan_GK_daily/370) का संबंध राजस्थान के विशिष्ट ऐतिहासिक व समसामयिक संदर्भ से है।</w:t>
+        <w:br/>
+        <w:t>2. विस्तृत आयाम व विवरण: RPSC परीक्षा उपयोगी महत्वपूर्ण विश्लेषण व आंकड़े</w:t>
+        <w:br/>
+        <w:t>3. परीक्षा प्रासंगिकता: RAS मुख्य परीक्षा (Paper 1/2/3) के दृष्टिकोण से अनिवार्य अध्ययन बिंदु।</w:t>
+        <w:br/>
+      </w:r>
+    </w:p>
+    <w:p>
+      <w:r>
+        <w:t>----------------------------------------</w:t>
+      </w:r>
+    </w:p>
+    <w:p>
+      <w:r>
+        <w:rPr>
+          <w:b/>
+        </w:rPr>
+        <w:t>प्रश्न [5 अंक - Paper 1 (राजस्थान इतिहास, कला व संस्कृति) - @Rajasthan_GK_Daily]: [12% वयस्क विवाहित कन्या को ससुराल भेजना 32% विवाह अवसर पर सामूहिक प्रीतिभोज 52% वर् के वधु घर आगमन पर वधु के पिता द्वारा स्वागत 5% गृहस्थ आश्रम में प्रवेश](https://t.me/Rajasthan_GK_daily/371)</w:t>
+        <w:br/>
+      </w:r>
+      <w:r>
+        <w:t>उत्तर ढांचा (~50 शब्द):</w:t>
+        <w:br/>
+        <w:t>1. मुख्य तथ्य व अवधारणा: [12% वयस्क विवाहित कन्या को ससुराल भेजना 32% विवाह अवसर पर सामूहिक प्रीतिभोज 52% वर् के वधु घर आगमन पर वधु के पिता द्वारा स्वागत 5% गृहस्थ आश्रम में प्रवेश](https://t.me/Rajasthan_GK_daily/371) का संबंध राजस्थान के विशिष्ट ऐतिहासिक व समसामयिक संदर्भ से है।</w:t>
+        <w:br/>
+        <w:t>2. विस्तृत आयाम व विवरण: RPSC परीक्षा उपयोगी महत्वपूर्ण विश्लेषण व आंकड़े</w:t>
+        <w:br/>
+        <w:t>3. परीक्षा प्रासंगिकता: RAS मुख्य परीक्षा (Paper 1/2/3) के दृष्टिकोण से अनिवार्य अध्ययन बिंदु।</w:t>
+        <w:br/>
+      </w:r>
+    </w:p>
+    <w:p>
+      <w:r>
+        <w:t>----------------------------------------</w:t>
+      </w:r>
+    </w:p>
+    <w:p>
+      <w:r>
+        <w:rPr>
+          <w:b/>
+        </w:rPr>
+        <w:t>प्रश्न [5 अंक - Paper 1 (राजस्थान इतिहास, कला व संस्कृति) - @Rajasthan_GK_Daily]: [33% कार्तिक पूर्णिमा 31% चैत्र कृष्ण त्रयोदशी 25% भाद्रपद शुक्ल त्रयोदशी 11% चैत्र शुक्ल त्रयोदशी](https://t.me/Rajasthan_GK_daily/372)</w:t>
+        <w:br/>
+      </w:r>
+      <w:r>
+        <w:t>उत्तर ढांचा (~50 शब्द):</w:t>
+        <w:br/>
+        <w:t>1. मुख्य तथ्य व अवधारणा: [33% कार्तिक पूर्णिमा 31% चैत्र कृष्ण त्रयोदशी 25% भाद्रपद शुक्ल त्रयोदशी 11% चैत्र शुक्ल त्रयोदशी](https://t.me/Rajasthan_GK_daily/372) का संबंध राजस्थान के विशिष्ट ऐतिहासिक व समसामयिक संदर्भ से है।</w:t>
+        <w:br/>
+        <w:t>2. विस्तृत आयाम व विवरण: RPSC परीक्षा उपयोगी महत्वपूर्ण विश्लेषण व आंकड़े</w:t>
+        <w:br/>
+        <w:t>3. परीक्षा प्रासंगिकता: RAS मुख्य परीक्षा (Paper 1/2/3) के दृष्टिकोण से अनिवार्य अध्ययन बिंदु।</w:t>
+        <w:br/>
+      </w:r>
+    </w:p>
+    <w:p>
+      <w:r>
+        <w:t>----------------------------------------</w:t>
+      </w:r>
+    </w:p>
+    <w:p>
+      <w:r>
+        <w:rPr>
+          <w:b/>
+        </w:rPr>
+        <w:t>प्रश्न [5 अंक - Paper 1 (राजस्थान इतिहास, कला व संस्कृति) - @currentaffairs]: **_**📖**_ Important Current affairs For All Upcoming Exams**[**#Hindi**](https://t.me/s/currentaffairs?q=%23Hindi)</w:t>
+        <w:br/>
+      </w:r>
+      <w:r>
+        <w:t>उत्तर ढांचा (~50 शब्द):</w:t>
+        <w:br/>
+        <w:t>1. मुख्य तथ्य व अवधारणा: **_**📖**_ Important Current affairs For All Upcoming Exams**[**#Hindi**](https://t.me/s/currentaffairs?q=%23Hindi) का संबंध राजस्थान के विशिष्ट ऐतिहासिक व समसामयिक संदर्भ से है।</w:t>
+        <w:br/>
+        <w:t>2. विस्तृत आयाम व विवरण: RPSC परीक्षा उपयोगी महत्वपूर्ण विश्लेषण व आंकड़े</w:t>
+        <w:br/>
+        <w:t>3. परीक्षा प्रासंगिकता: RAS मुख्य परीक्षा (Paper 1/2/3) के दृष्टिकोण से अनिवार्य अध्ययन बिंदु।</w:t>
+        <w:br/>
+      </w:r>
+    </w:p>
+    <w:p>
+      <w:r>
+        <w:t>----------------------------------------</w:t>
+      </w:r>
+    </w:p>
+    <w:p>
+      <w:r>
+        <w:rPr>
+          <w:b/>
+        </w:rPr>
+        <w:t>प्रश्न [5 अंक - Paper 1 (राजस्थान इतिहास, कला व संस्कृति) - @Rajasthan_Gk_history_culture]: RPSC 2nd grade 2022 100% सफलता के लिए हमारे साथ मिलकर तैयारी करें. हम शिक्षा मनोविज्ञान and SST का अध्ययन B.ed and 11th, 12th की Books से कर रहे हैं. जो आपकी सफलता के लिए सबसे उपयुक्त रहेगी.</w:t>
+        <w:br/>
+      </w:r>
+      <w:r>
+        <w:t>उत्तर ढांचा (~50 शब्द):</w:t>
+        <w:br/>
+        <w:t>1. मुख्य तथ्य व अवधारणा: RPSC 2nd grade 2022 100% सफलता के लिए हमारे साथ मिलकर तैयारी करें. हम शिक्षा मनोविज्ञान and SST का अध्ययन B.ed and 11th, 12th की Books से कर रहे हैं. जो आपकी सफलता के लिए सबसे उपयुक्त रहेगी. का संबंध राजस्थान के विशिष्ट ऐतिहासिक व समसामयिक संदर्भ से है।</w:t>
+        <w:br/>
+        <w:t>2. विस्तृत आयाम व विवरण: धन्यवाद</w:t>
+        <w:br/>
+        <w:t>3. परीक्षा प्रासंगिकता: RAS मुख्य परीक्षा (Paper 1/2/3) के दृष्टिकोण से अनिवार्य अध्ययन बिंदु।</w:t>
+        <w:br/>
+      </w:r>
+    </w:p>
+    <w:p>
+      <w:r>
+        <w:t>----------------------------------------</w:t>
+      </w:r>
+    </w:p>
+    <w:p>
+      <w:r>
+        <w:rPr>
+          <w:b/>
+        </w:rPr>
+        <w:t>प्रश्न [5 अंक - Paper 1 (राजस्थान इतिहास, कला व संस्कृति) - @CivilSigmaRAS]: राजस्थान प्रशासनिक सेवा की तैयारी करने वाले अभ्यर्थियों का मंच।</w:t>
+        <w:br/>
+      </w:r>
+      <w:r>
+        <w:t>उत्तर ढांचा (~50 शब्द):</w:t>
+        <w:br/>
+        <w:t>1. मुख्य तथ्य व अवधारणा: राजस्थान प्रशासनिक सेवा की तैयारी करने वाले अभ्यर्थियों का मंच। का संबंध राजस्थान के विशिष्ट ऐतिहासिक व समसामयिक संदर्भ से है।</w:t>
+        <w:br/>
+        <w:t>2. विस्तृत आयाम व विवरण: Owner- [@Ashok_Poonia_ID](https://t.me/Ashok_Poonia_ID)</w:t>
+        <w:br/>
+        <w:t>3. परीक्षा प्रासंगिकता: RAS मुख्य परीक्षा (Paper 1/2/3) के दृष्टिकोण से अनिवार्य अध्ययन बिंदु।</w:t>
+        <w:br/>
+      </w:r>
+    </w:p>
+    <w:p>
+      <w:r>
+        <w:t>----------------------------------------</w:t>
       </w:r>
     </w:p>
     <w:sectPr>

</xml_diff>